<commit_message>
v0.5.2: cv tailored-for line is now inserted by tailor_cv.py, not string-replaced
The baseline CV no longer carries a tailored-for paragraph. tailor_cv.py
gains a --tailored-for flag that inserts the tag (small italic gray
centered paragraph) between the contact line and EXECUTIVE SUMMARY.
cv-tailor.md and CV-REQUIREMENTS.md updated; verification text-index map
re-derived and confirmed against the new baseline; highlight-cell swap
examples updated from Sales-Led Culture Navigation to Inflection-Point
Operator with a uniqueness caution; libreoffice/soffice PATH fallback for
PDF conversion; cv-baseline-reference.pdf regenerated.

Co-Authored-By: Claude Fable 5 <noreply@anthropic.com>
</commit_message>
<xml_diff>
--- a/templates/cv-baseline.docx
+++ b/templates/cv-baseline.docx
@@ -32,7 +32,7 @@
           <w:sz w:val="22"/>
           <w:szCs w:val="22"/>
         </w:rPr>
-        <w:t xml:space="preserve">Chief Product Officer | AI Platform Strategy | Operating Rhythm Builder | Sales-Led Culture Navigator | $120M+ ARR</w:t>
+        <w:t xml:space="preserve">Chief Product Officer | AI-Native Operating Models | B2B SaaS Product Orgs at Scale | $120M+ ARR</w:t>
       </w:r>
     </w:p>
     <w:p>
@@ -46,7 +46,7 @@
           <w:sz w:val="18"/>
           <w:szCs w:val="18"/>
         </w:rPr>
-        <w:t xml:space="preserve">Lisbon, Portugal (US Citizen, Open to UK Relocation)  ·  +1 (650) 283-8867  ·  </w:t>
+        <w:t xml:space="preserve">Lisbon, Portugal (US Citizen)  ·  +1 (650) 283-8867  ·  </w:t>
       </w:r>
       <w:hyperlink w:history="1" r:id="rIdhqmya5uwkoy1ch41tggif">
         <w:r>
@@ -103,23 +103,6 @@
     </w:p>
     <w:p>
       <w:pPr>
-        <w:spacing w:after="100"/>
-        <w:jc w:val="center"/>
-      </w:pPr>
-      <w:r>
-        <w:rPr>
-          <w:rFonts w:ascii="Arial" w:cs="Arial" w:eastAsia="Arial" w:hAnsi="Arial"/>
-          <w:i/>
-          <w:iCs/>
-          <w:color w:val="888888"/>
-          <w:sz w:val="16"/>
-          <w:szCs w:val="16"/>
-        </w:rPr>
-        <w:t xml:space="preserve">Tailored for 9fin, VP Product</w:t>
-      </w:r>
-    </w:p>
-    <w:p>
-      <w:pPr>
         <w:pBdr>
           <w:bottom w:val="single" w:color="1F6F4A" w:sz="12" w:space="4"/>
         </w:pBdr>
@@ -147,7 +130,7 @@
           <w:sz w:val="20"/>
           <w:szCs w:val="20"/>
         </w:rPr>
-        <w:t xml:space="preserve">Product executive with 25+ years scaling data-driven SaaS platforms inside fast-moving, sales-first cultures. Track record installing structure, clarity, and operating rhythm (planning, rituals, communication, tooling) without slowing the commercial engine, while mentoring product leaders through coaching and direct feedback. Most recent platform serves blue-chip institutional customers across 195+ countries with 7B+ signals/month, the closest analogue to 9fin's AI platform for global debt markets.</w:t>
+        <w:t xml:space="preserve">Product executive with 25+ years scaling data-driven SaaS platforms inside fast-moving, sales-first cultures. Track record installing structure, clarity, and operating rhythm (planning, rituals, communication, tooling) without slowing the commercial engine, while mentoring product leaders through coaching and direct feedback. Most recent platform serves blue-chip institutional customers across 195+ countries with 7B+ signals/month, paired with hands-on AI-native building at Cimanote and Kairos.</w:t>
       </w:r>
     </w:p>
     <w:p>
@@ -216,17 +199,17 @@
                 <w:sz w:val="20"/>
                 <w:szCs w:val="20"/>
               </w:rPr>
-              <w:t xml:space="preserve">Sales-Led Culture Navigation</w:t>
-            </w:r>
-          </w:p>
-          <w:p>
-            <w:r>
-              <w:rPr>
-                <w:rFonts w:ascii="Arial" w:cs="Arial" w:eastAsia="Arial" w:hAnsi="Arial"/>
-                <w:sz w:val="18"/>
-                <w:szCs w:val="18"/>
-              </w:rPr>
-              <w:t xml:space="preserve">Installed product discipline inside high-energy sales cultures at Simpplr and Usercentrics without breaking the commercial engine.</w:t>
+              <w:t xml:space="preserve">Inflection-Point Operator</w:t>
+            </w:r>
+          </w:p>
+          <w:p>
+            <w:r>
+              <w:rPr>
+                <w:rFonts w:ascii="Arial" w:cs="Arial" w:eastAsia="Arial" w:hAnsi="Arial"/>
+                <w:sz w:val="18"/>
+                <w:szCs w:val="18"/>
+              </w:rPr>
+              <w:t xml:space="preserve">Walked into Usercentrics, Simpplr, and Visit.org at inflection points and built the product function to scale the business.</w:t>
             </w:r>
           </w:p>
         </w:tc>
@@ -650,7 +633,7 @@
           <w:sz w:val="18"/>
           <w:szCs w:val="18"/>
         </w:rPr>
-        <w:t xml:space="preserve">Direct analogue to 9fin's AI-platform-for-debt-markets shape: led product on a privacy-first data platform across 195+ countries with 7B+ signals/month, blue-chip institutional customers, and global data scale.</w:t>
+        <w:t xml:space="preserve">Led product on a privacy-first data platform at global scale: 2.3M+ websites and apps, 7B+ signals/month across 195+ countries, blue-chip enterprise customers.</w:t>
       </w:r>
     </w:p>
     <w:p>
@@ -932,7 +915,7 @@
           <w:sz w:val="18"/>
           <w:szCs w:val="18"/>
         </w:rPr>
-        <w:t xml:space="preserve">The most direct sales-led-culture parallel to the 9fin mandate: installed product discipline inside a sales-first culture without breaking the commercial engine, scaling ARR from $4.6M to $28.4M.</w:t>
+        <w:t xml:space="preserve">Installed product discipline inside a sales-first culture without breaking the commercial engine, scaling ARR from $4.6M to $28.4M.</w:t>
       </w:r>
     </w:p>
     <w:p>
@@ -1768,7 +1751,7 @@
                 <w:sz w:val="18"/>
                 <w:szCs w:val="18"/>
               </w:rPr>
-              <w:t xml:space="preserve">Postgraduate Studies, MS Electrical Engineering, Los Angeles, CA</w:t>
+              <w:t xml:space="preserve">Graduate studies in Electrical Engineering (VLSI/IC), Los Angeles, CA</w:t>
             </w:r>
           </w:p>
         </w:tc>

</xml_diff>